<commit_message>
feat: move country validation to agency owners
</commit_message>
<xml_diff>
--- a/docs/testing/SMF_Travel_Rapporto_Completo_Test_v1.2_2026-09-01.docx
+++ b/docs/testing/SMF_Travel_Rapporto_Completo_Test_v1.2_2026-09-01.docx
@@ -9540,7 +9540,7 @@
                 <w:color w:val="102A35"/>
                 <w:sz w:val="16"/>
               </w:rPr>
-              <w:t>Revisione Superuser del profilo Paese</w:t>
+              <w:t>Revisione del responsabile dell'agenzia</w:t>
             </w:r>
           </w:p>
         </w:tc>
@@ -9580,7 +9580,7 @@
                 <w:color w:val="102A35"/>
                 <w:sz w:val="15"/>
               </w:rPr>
-              <w:t>Stato approvato e provenienza ufficiale coperti da regressione e schema.</w:t>
+              <w:t>Approvazione isolata per agenzia e versione; superuser e utenti non owner esclusi dal controllo.</w:t>
             </w:r>
           </w:p>
         </w:tc>

</xml_diff>